<commit_message>
Truefiling file step fixed for changing child support, updated learn set aside, fill set aside and fill modify with notice of motion forms and addressed github issue in set aside
</commit_message>
<xml_diff>
--- a/docassemble/AKA2JBranding/data/templates/fill_modify_content.docx
+++ b/docassemble/AKA2JBranding/data/templates/fill_modify_content.docx
@@ -138,9 +138,6 @@
     <w:p>
       <w:pPr>
         <w:pStyle w:val="Body"/>
-        <w:rPr>
-          <w:color w:val="000000" w:themeColor="text1"/>
-        </w:rPr>
       </w:pPr>
       <w:r>
         <w:rPr>
@@ -192,6 +189,47 @@
           <w:t>ak-courts.info/dr710</w:t>
         </w:r>
       </w:hyperlink>
+      <w:r>
+        <w:rPr>
+          <w:rStyle w:val="Hyperlink"/>
+          <w:spacing w:val="0"/>
+        </w:rPr>
+        <w:br/>
+      </w:r>
+      <w:r>
+        <w:t>Required if you are filing </w:t>
+      </w:r>
+      <w:hyperlink r:id="rId14" w:anchor="post-judgment" w:tgtFrame="_blank" w:history="1">
+        <w:r>
+          <w:t>post-judgment</w:t>
+        </w:r>
+      </w:hyperlink>
+      <w:r>
+        <w:t> and </w:t>
+      </w:r>
+      <w:r>
+        <w:rPr>
+          <w:b/>
+          <w:bCs/>
+        </w:rPr>
+        <w:t>eithe</w:t>
+      </w:r>
+      <w:r>
+        <w:t>r (1) the other side was not represented by a lawyer, </w:t>
+      </w:r>
+      <w:r>
+        <w:rPr>
+          <w:b/>
+          <w:bCs/>
+        </w:rPr>
+        <w:t>or</w:t>
+      </w:r>
+      <w:r>
+        <w:t> (2) the other side was represented by a lawyer, but more than 1 year has passed since the final judgment</w:t>
+      </w:r>
+      <w:r>
+        <w:t>.</w:t>
+      </w:r>
     </w:p>
     <w:p>
       <w:pPr>
@@ -214,7 +252,7 @@
         </w:rPr>
         <w:t xml:space="preserve"> [</w:t>
       </w:r>
-      <w:hyperlink r:id="rId14" w:history="1">
+      <w:hyperlink r:id="rId15" w:history="1">
         <w:r>
           <w:rPr>
             <w:rStyle w:val="Hyperlink"/>
@@ -235,7 +273,7 @@
         </w:rPr>
         <w:br/>
       </w:r>
-      <w:hyperlink r:id="rId15" w:history="1">
+      <w:hyperlink r:id="rId16" w:history="1">
         <w:r>
           <w:rPr>
             <w:rStyle w:val="Hyperlink"/>
@@ -292,7 +330,7 @@
         </w:rPr>
         <w:t xml:space="preserve"> [</w:t>
       </w:r>
-      <w:hyperlink r:id="rId16" w:history="1">
+      <w:hyperlink r:id="rId17" w:history="1">
         <w:r>
           <w:rPr>
             <w:rStyle w:val="Hyperlink"/>
@@ -319,7 +357,7 @@
         </w:rPr>
         <w:br/>
       </w:r>
-      <w:hyperlink r:id="rId17" w:history="1">
+      <w:hyperlink r:id="rId18" w:history="1">
         <w:r>
           <w:rPr>
             <w:rStyle w:val="Hyperlink"/>
@@ -479,7 +517,7 @@
       <w:r>
         <w:t xml:space="preserve"> [</w:t>
       </w:r>
-      <w:hyperlink r:id="rId18" w:history="1">
+      <w:hyperlink r:id="rId19" w:history="1">
         <w:r>
           <w:rPr>
             <w:rStyle w:val="Hyperlink"/>
@@ -494,7 +532,7 @@
       <w:r>
         <w:br/>
       </w:r>
-      <w:hyperlink r:id="rId19" w:history="1">
+      <w:hyperlink r:id="rId20" w:history="1">
         <w:r>
           <w:rPr>
             <w:rStyle w:val="Hyperlink"/>
@@ -570,6 +608,7 @@
         <w:pStyle w:val="Exampleparagraph"/>
       </w:pPr>
       <w:r>
+        <w:lastRenderedPageBreak/>
         <w:t>If you fill out paper copies of the forms, or do not file them with TrueFiling, read</w:t>
       </w:r>
       <w:r>
@@ -595,7 +634,6 @@
         <w:pStyle w:val="Heading3"/>
       </w:pPr>
       <w:r>
-        <w:lastRenderedPageBreak/>
         <w:t xml:space="preserve">Watch </w:t>
       </w:r>
     </w:p>
@@ -608,7 +646,7 @@
         </w:numPr>
         <w:ind w:left="390"/>
       </w:pPr>
-      <w:hyperlink r:id="rId20" w:history="1">
+      <w:hyperlink r:id="rId21" w:history="1">
         <w:r>
           <w:rPr>
             <w:rStyle w:val="Hyperlink"/>
@@ -622,7 +660,7 @@
         </w:rPr>
         <w:br/>
       </w:r>
-      <w:hyperlink r:id="rId21" w:history="1">
+      <w:hyperlink r:id="rId22" w:history="1">
         <w:r>
           <w:rPr>
             <w:rStyle w:val="Hyperlink"/>
@@ -646,12 +684,12 @@
       </w:hyperlink>
     </w:p>
     <w:sectPr>
-      <w:headerReference w:type="even" r:id="rId22"/>
-      <w:headerReference w:type="default" r:id="rId23"/>
-      <w:footerReference w:type="even" r:id="rId24"/>
-      <w:footerReference w:type="default" r:id="rId25"/>
-      <w:headerReference w:type="first" r:id="rId26"/>
-      <w:footerReference w:type="first" r:id="rId27"/>
+      <w:headerReference w:type="even" r:id="rId23"/>
+      <w:headerReference w:type="default" r:id="rId24"/>
+      <w:footerReference w:type="even" r:id="rId25"/>
+      <w:footerReference w:type="default" r:id="rId26"/>
+      <w:headerReference w:type="first" r:id="rId27"/>
+      <w:footerReference w:type="first" r:id="rId28"/>
       <w:pgSz w:w="12240" w:h="15840"/>
       <w:pgMar w:top="1440" w:right="1440" w:bottom="1440" w:left="1440" w:header="720" w:footer="720" w:gutter="0"/>
       <w:cols w:space="720"/>
@@ -2627,7 +2665,6 @@
   <w:style w:type="character" w:default="1" w:styleId="DefaultParagraphFont">
     <w:name w:val="Default Paragraph Font"/>
     <w:uiPriority w:val="1"/>
-    <w:semiHidden/>
     <w:unhideWhenUsed/>
   </w:style>
   <w:style w:type="table" w:default="1" w:styleId="TableNormal">

</xml_diff>